<commit_message>
Criacao da Tabela de Data e SLA
</commit_message>
<xml_diff>
--- a/ESPECIFICAÇÃO TÉCNICA E FUNCIONAL Verdana.docx
+++ b/ESPECIFICAÇÃO TÉCNICA E FUNCIONAL Verdana.docx
@@ -2757,11 +2757,9 @@
           <w:numId w:val="27"/>
         </w:numPr>
       </w:pPr>
-      <w:proofErr w:type="spellStart"/>
       <w:r>
         <w:t>Deduplicação</w:t>
       </w:r>
-      <w:proofErr w:type="spellEnd"/>
     </w:p>
     <w:p>
       <w:pPr>
@@ -2808,13 +2806,8 @@
         </w:numPr>
       </w:pPr>
       <w:r>
-        <w:t xml:space="preserve">Inserção </w:t>
-      </w:r>
-      <w:proofErr w:type="gramStart"/>
-      <w:r>
-        <w:t>na fato</w:t>
-      </w:r>
-      <w:proofErr w:type="gramEnd"/>
+        <w:t>Inserção na fato</w:t>
+      </w:r>
     </w:p>
     <w:p>
       <w:r>
@@ -2867,13 +2860,8 @@
           <w:numId w:val="29"/>
         </w:numPr>
       </w:pPr>
-      <w:proofErr w:type="spellStart"/>
-      <w:r>
-        <w:t>Encoding</w:t>
-      </w:r>
-      <w:proofErr w:type="spellEnd"/>
-      <w:r>
-        <w:t xml:space="preserve"> incorreto</w:t>
+      <w:r>
+        <w:t>Encoding incorreto</w:t>
       </w:r>
     </w:p>
     <w:p>
@@ -13208,6 +13196,7 @@
   <w:style w:type="character" w:default="1" w:styleId="Fontepargpadro">
     <w:name w:val="Default Paragraph Font"/>
     <w:uiPriority w:val="1"/>
+    <w:semiHidden/>
     <w:unhideWhenUsed/>
   </w:style>
   <w:style w:type="table" w:default="1" w:styleId="Tabelanormal">

</xml_diff>

<commit_message>
Adicionando a Tabela de Localidade
</commit_message>
<xml_diff>
--- a/ESPECIFICAÇÃO TÉCNICA E FUNCIONAL Verdana.docx
+++ b/ESPECIFICAÇÃO TÉCNICA E FUNCIONAL Verdana.docx
@@ -545,12 +545,10 @@
       <w:r>
         <w:t>Dw</w:t>
       </w:r>
-      <w:proofErr w:type="gramStart"/>
       <w:r>
         <w:t>_Chamados</w:t>
       </w:r>
       <w:proofErr w:type="spellEnd"/>
-      <w:proofErr w:type="gramEnd"/>
     </w:p>
     <w:p>
       <w:r>
@@ -659,13 +657,8 @@
         </w:numPr>
       </w:pPr>
       <w:proofErr w:type="spellStart"/>
-      <w:proofErr w:type="gramStart"/>
-      <w:r>
-        <w:t>eh</w:t>
-      </w:r>
-      <w:proofErr w:type="gramEnd"/>
-      <w:r>
-        <w:t>_dia_util</w:t>
+      <w:r>
+        <w:t>eh_dia_util</w:t>
       </w:r>
       <w:proofErr w:type="spellEnd"/>
     </w:p>
@@ -1645,6 +1638,16 @@
       <w:r>
         <w:t xml:space="preserve"> (chave de negócio)</w:t>
       </w:r>
+      <w:r>
+        <w:t xml:space="preserve"> </w:t>
+      </w:r>
+      <w:r>
+        <w:rPr>
+          <w:b/>
+          <w:bCs/>
+        </w:rPr>
+        <w:sym w:font="Wingdings" w:char="F0FC"/>
+      </w:r>
     </w:p>
     <w:p>
       <w:pPr>
@@ -1655,6 +1658,19 @@
       </w:pPr>
       <w:r>
         <w:t>título</w:t>
+      </w:r>
+      <w:r>
+        <w:t xml:space="preserve"> </w:t>
+      </w:r>
+      <w:r>
+        <w:t xml:space="preserve"> </w:t>
+      </w:r>
+      <w:r>
+        <w:rPr>
+          <w:b/>
+          <w:bCs/>
+        </w:rPr>
+        <w:sym w:font="Wingdings" w:char="F0FC"/>
       </w:r>
     </w:p>
     <w:p>
@@ -1792,6 +1808,19 @@
         <w:t>grupo_sk</w:t>
       </w:r>
       <w:proofErr w:type="spellEnd"/>
+      <w:r>
+        <w:t xml:space="preserve"> </w:t>
+      </w:r>
+      <w:r>
+        <w:t xml:space="preserve"> </w:t>
+      </w:r>
+      <w:r>
+        <w:rPr>
+          <w:b/>
+          <w:bCs/>
+        </w:rPr>
+        <w:sym w:font="Wingdings" w:char="F0FC"/>
+      </w:r>
     </w:p>
     <w:p>
       <w:pPr>
@@ -1906,6 +1935,16 @@
         <w:t>sla_sk</w:t>
       </w:r>
       <w:proofErr w:type="spellEnd"/>
+      <w:r>
+        <w:t xml:space="preserve"> </w:t>
+      </w:r>
+      <w:r>
+        <w:rPr>
+          <w:b/>
+          <w:bCs/>
+        </w:rPr>
+        <w:sym w:font="Wingdings" w:char="F0FC"/>
+      </w:r>
     </w:p>
     <w:p>
       <w:r>
@@ -1951,15 +1990,7 @@
       </w:pPr>
       <w:proofErr w:type="spellStart"/>
       <w:r>
-        <w:t>dt_</w:t>
-      </w:r>
-      <w:proofErr w:type="gramStart"/>
-      <w:r>
-        <w:t>ultima</w:t>
-      </w:r>
-      <w:proofErr w:type="gramEnd"/>
-      <w:r>
-        <w:t>_atualizacao_sk</w:t>
+        <w:t>dt_ultima_atualizacao_sk</w:t>
       </w:r>
       <w:proofErr w:type="spellEnd"/>
     </w:p>
@@ -2481,13 +2512,8 @@
       </w:r>
     </w:p>
     <w:p>
-      <w:proofErr w:type="gramStart"/>
-      <w:r>
-        <w:t>status !</w:t>
-      </w:r>
-      <w:proofErr w:type="gramEnd"/>
-      <w:r>
-        <w:t>= fechado</w:t>
+      <w:r>
+        <w:t>status != fechado</w:t>
       </w:r>
     </w:p>
     <w:p>
@@ -3988,13 +4014,8 @@
       </w:r>
     </w:p>
     <w:p>
-      <w:proofErr w:type="gramStart"/>
-      <w:r>
-        <w:t>AVG(</w:t>
-      </w:r>
-      <w:proofErr w:type="gramEnd"/>
-      <w:r>
-        <w:t>data_fechamento - data_criacao)</w:t>
+      <w:r>
+        <w:t>AVG(data_fechamento - data_criacao)</w:t>
       </w:r>
     </w:p>
     <w:p>

</xml_diff>